<commit_message>
some fixes are made
</commit_message>
<xml_diff>
--- a/docs/Supplementary_Table_Captions_final_20260606.docx
+++ b/docs/Supplementary_Table_Captions_final_20260606.docx
@@ -12,7 +12,7 @@
     </w:p>
     <w:p>
       <w:r>
-        <w:t>The supplementary tables make the benchmark auditable by linking method scope, the 100-dataset atlas, metric construction, figure source data, targeted sensitivity experiments and data/code availability routes to explicit source evidence.</w:t>
+        <w:t>One-sentence argument: The supplementary tables make the benchmark auditable by linking method scope, the 100-dataset atlas, metric construction, figure source data, targeted sensitivity experiments and data/code availability routes to explicit source evidence.</w:t>
       </w:r>
     </w:p>
     <w:p>
@@ -20,12 +20,20 @@
         <w:pStyle w:val="Heading2"/>
       </w:pPr>
       <w:r>
+        <w:t>Ready-To-Paste Captions</w:t>
+      </w:r>
+    </w:p>
+    <w:p>
+      <w:pPr>
+        <w:pStyle w:val="Heading3"/>
+      </w:pPr>
+      <w:r>
         <w:t>Supplementary Table S1. Dimensionality-reduction method catalogue and benchmark scope</w:t>
       </w:r>
     </w:p>
     <w:p>
       <w:r>
-        <w:t>Catalogue of dimensionality-reduction methods included in the benchmark. The table lists the 26 full-benchmark methods, their method families, implementation principles, implementation languages, software/source links and references, and separately marks result variants and the targeted scVI reference analysis that are not counted as part of the 26-method benchmark.</w:t>
+        <w:t>Catalogue of dimensionality-reduction methods included in the benchmark. The table lists the 26 full-benchmark methods, their method families, method-origin status, implementation principles, implementation languages, software/source links and references, and separately marks result variants and the targeted scVI reference analysis that are not counted as part of the 26-method benchmark.</w:t>
       </w:r>
     </w:p>
     <w:p>
@@ -35,7 +43,7 @@
     </w:p>
     <w:p>
       <w:pPr>
-        <w:pStyle w:val="Heading2"/>
+        <w:pStyle w:val="Heading3"/>
       </w:pPr>
       <w:r>
         <w:t>Supplementary Table S2. Manuscript 100-dataset atlas</w:t>
@@ -53,7 +61,7 @@
     </w:p>
     <w:p>
       <w:pPr>
-        <w:pStyle w:val="Heading2"/>
+        <w:pStyle w:val="Heading3"/>
       </w:pPr>
       <w:r>
         <w:t>Supplementary Table S3. Fifty-real-dataset metadata concordance table</w:t>
@@ -71,7 +79,7 @@
     </w:p>
     <w:p>
       <w:pPr>
-        <w:pStyle w:val="Heading2"/>
+        <w:pStyle w:val="Heading3"/>
       </w:pPr>
       <w:r>
         <w:t>Supplementary Table S4. Simulated-dataset parameter atlas</w:t>
@@ -89,7 +97,7 @@
     </w:p>
     <w:p>
       <w:pPr>
-        <w:pStyle w:val="Heading2"/>
+        <w:pStyle w:val="Heading3"/>
       </w:pPr>
       <w:r>
         <w:t>Supplementary Table S5. Benchmark metric inventory and profile-score components</w:t>
@@ -107,7 +115,7 @@
     </w:p>
     <w:p>
       <w:pPr>
-        <w:pStyle w:val="Heading2"/>
+        <w:pStyle w:val="Heading3"/>
       </w:pPr>
       <w:r>
         <w:t>Supplementary Table S6. Completed per-method profile-score matrix</w:t>
@@ -125,7 +133,7 @@
     </w:p>
     <w:p>
       <w:pPr>
-        <w:pStyle w:val="Heading2"/>
+        <w:pStyle w:val="Heading3"/>
       </w:pPr>
       <w:r>
         <w:t>Supplementary Table S7. Structure-preservation metric coverage summary</w:t>
@@ -143,7 +151,7 @@
     </w:p>
     <w:p>
       <w:pPr>
-        <w:pStyle w:val="Heading2"/>
+        <w:pStyle w:val="Heading3"/>
       </w:pPr>
       <w:r>
         <w:t>Supplementary Table S8. Clustering-concordance metric coverage summary</w:t>
@@ -161,7 +169,7 @@
     </w:p>
     <w:p>
       <w:pPr>
-        <w:pStyle w:val="Heading2"/>
+        <w:pStyle w:val="Heading3"/>
       </w:pPr>
       <w:r>
         <w:t>Supplementary Table S9. Simulated robustness and stability score audit</w:t>
@@ -179,7 +187,7 @@
     </w:p>
     <w:p>
       <w:pPr>
-        <w:pStyle w:val="Heading2"/>
+        <w:pStyle w:val="Heading3"/>
       </w:pPr>
       <w:r>
         <w:t>Supplementary Table S10. Scalability, completion and implementation audit</w:t>
@@ -197,7 +205,7 @@
     </w:p>
     <w:p>
       <w:pPr>
-        <w:pStyle w:val="Heading2"/>
+        <w:pStyle w:val="Heading3"/>
       </w:pPr>
       <w:r>
         <w:t>Supplementary Table S11. Targeted sensitivity experiment manifest</w:t>
@@ -215,7 +223,7 @@
     </w:p>
     <w:p>
       <w:pPr>
-        <w:pStyle w:val="Heading2"/>
+        <w:pStyle w:val="Heading3"/>
       </w:pPr>
       <w:r>
         <w:t>Supplementary Table S12. Supplementary figure panel map</w:t>
@@ -233,7 +241,7 @@
     </w:p>
     <w:p>
       <w:pPr>
-        <w:pStyle w:val="Heading2"/>
+        <w:pStyle w:val="Heading3"/>
       </w:pPr>
       <w:r>
         <w:t>Supplementary Table S13. Supplementary evidence-layer coverage map</w:t>
@@ -251,7 +259,7 @@
     </w:p>
     <w:p>
       <w:pPr>
-        <w:pStyle w:val="Heading2"/>
+        <w:pStyle w:val="Heading3"/>
       </w:pPr>
       <w:r>
         <w:t>Supplementary Table S14. Source-data file manifest</w:t>
@@ -269,7 +277,7 @@
     </w:p>
     <w:p>
       <w:pPr>
-        <w:pStyle w:val="Heading2"/>
+        <w:pStyle w:val="Heading3"/>
       </w:pPr>
       <w:r>
         <w:t>Supplementary Table S15. Data availability and source-data route audit</w:t>
@@ -285,9 +293,57 @@
         <w:t>Linked evidence: Data Availability; all source data.</w:t>
       </w:r>
     </w:p>
+    <w:p>
+      <w:pPr>
+        <w:pStyle w:val="Heading2"/>
+      </w:pPr>
+      <w:r>
+        <w:t>Chinese Author Notes</w:t>
+      </w:r>
+    </w:p>
+    <w:p>
+      <w:pPr>
+        <w:pStyle w:val="ListBullet"/>
+      </w:pPr>
+      <w:r>
+        <w:t>S1 defines the 26 full-benchmark methods and separately marks scVI as a targeted reference analysis, preventing ambiguity about the 26-method benchmark scope.</w:t>
+      </w:r>
+    </w:p>
+    <w:p>
+      <w:pPr>
+        <w:pStyle w:val="ListBullet"/>
+      </w:pPr>
+      <w:r>
+        <w:t>S2/S3/S4 jointly support the 100-dataset atlas, with S3 realigned to the 50 real datasets.</w:t>
+      </w:r>
+    </w:p>
+    <w:p>
+      <w:pPr>
+        <w:pStyle w:val="ListBullet"/>
+      </w:pPr>
+      <w:r>
+        <w:t>S5/S6 provide the tabular evidence for Figure 3 score calculation and the final profile-score matrix.</w:t>
+      </w:r>
+    </w:p>
+    <w:p>
+      <w:pPr>
+        <w:pStyle w:val="ListBullet"/>
+      </w:pPr>
+      <w:r>
+        <w:t>S7/S8/S9/S10 correspond to structure preservation, clustering concordance, simulated stability and computational efficiency, supporting main Figures 4/5/7/8.</w:t>
+      </w:r>
+    </w:p>
+    <w:p>
+      <w:pPr>
+        <w:pStyle w:val="ListBullet"/>
+      </w:pPr>
+      <w:r>
+        <w:t>S11 supports the targeted sensitivity experiments and scVI reference analysis; S12/S13 document panel-level and evidence-layer coverage for the Supplementary Figure atlas; S14/S15 support source data and Data Availability.</w:t>
+      </w:r>
+    </w:p>
     <w:sectPr>
       <w:pgSz w:w="12240" w:h="15840"/>
-      <w:pgMar w:top="1080" w:right="1080" w:bottom="1080" w:left="1080" w:header="720" w:footer="720" w:gutter="0"/>
+      <w:pgMar w:top="1440" w:right="1800" w:bottom="1440" w:left="1800" w:header="720" w:footer="720" w:gutter="0"/>
       <w:cols w:space="720"/>
       <w:docGrid w:linePitch="360"/>
     </w:sectPr>
@@ -659,8 +715,8 @@
     <w:qFormat/>
     <w:rsid w:val="00FC693F"/>
     <w:rPr>
-      <w:rFonts w:ascii="Arial" w:hAnsi="Arial"/>
-      <w:sz w:val="20"/>
+      <w:rFonts w:ascii="Times New Roman" w:hAnsi="Times New Roman"/>
+      <w:sz w:val="22"/>
     </w:rPr>
   </w:style>
   <w:style w:type="paragraph" w:styleId="Header">

</xml_diff>